<commit_message>
Update book chapters and website
</commit_message>
<xml_diff>
--- a/Back to basics policy evaluation methods.docx
+++ b/Back to basics policy evaluation methods.docx
@@ -105,13 +105,21 @@
         </w:numPr>
       </w:pPr>
       <w:r>
-        <w:t>La scrittura di questo mini</w:t>
+        <w:t xml:space="preserve">La scrittura di questo </w:t>
+      </w:r>
+      <w:proofErr w:type="spellStart"/>
+      <w:r>
+        <w:t>mini</w:t>
       </w:r>
       <w:r>
         <w:t>e</w:t>
       </w:r>
       <w:r>
-        <w:t>book nasce dalla mia frustrazione nel vedere la direzione della disciplina… i tecnicismi hanno preso il sopravvento sull’essenza… le mode contano più della sostanza… l’innovatività fuori da certi schemi viene vista con forte scetticismo…</w:t>
+        <w:t>book</w:t>
+      </w:r>
+      <w:proofErr w:type="spellEnd"/>
+      <w:r>
+        <w:t xml:space="preserve"> nasce dalla mia frustrazione nel vedere la direzione della disciplina… i tecnicismi hanno preso il sopravvento sull’essenza… le mode contano più della sostanza… l’innovatività fuori da certi schemi viene vista con forte scetticismo…</w:t>
       </w:r>
     </w:p>
     <w:p>
@@ -140,35 +148,27 @@
           <w:numId w:val="2"/>
         </w:numPr>
         <w:rPr>
-          <w:lang w:val="en-US"/>
-        </w:rPr>
-      </w:pPr>
-      <w:r>
-        <w:rPr>
+          <w:highlight w:val="darkGray"/>
+          <w:lang w:val="en-US"/>
+        </w:rPr>
+      </w:pPr>
+      <w:r>
+        <w:rPr>
+          <w:highlight w:val="darkGray"/>
           <w:lang w:val="en-US"/>
         </w:rPr>
         <w:t xml:space="preserve">We should </w:t>
       </w:r>
       <w:r>
         <w:rPr>
-          <w:lang w:val="en-US"/>
-        </w:rPr>
-        <w:t>always discuss (all) the assumptions behind the evalu</w:t>
-      </w:r>
-      <w:r>
-        <w:rPr>
-          <w:lang w:val="en-US"/>
-        </w:rPr>
-        <w:t>ation method adopted and discuss why we believe them</w:t>
-      </w:r>
-      <w:r>
-        <w:rPr>
-          <w:lang w:val="en-US"/>
-        </w:rPr>
-        <w:t xml:space="preserve"> </w:t>
-      </w:r>
-      <w:r>
-        <w:rPr>
+          <w:highlight w:val="darkGray"/>
+          <w:lang w:val="en-US"/>
+        </w:rPr>
+        <w:t xml:space="preserve">always discuss (all) the assumptions behind the evaluation method adopted and discuss why we believe them </w:t>
+      </w:r>
+      <w:r>
+        <w:rPr>
+          <w:highlight w:val="darkGray"/>
           <w:lang w:val="en-US"/>
         </w:rPr>
         <w:t xml:space="preserve"> </w:t>
@@ -183,10 +183,42 @@
         </w:numPr>
       </w:pPr>
       <w:r>
-        <w:t>Chiarire la differenza tra c</w:t>
-      </w:r>
-      <w:r>
-        <w:t>ausal estimands and estimators. Spiegare i principali causal estimands con i loro pro e contro. Dire che non sempre i paper chiariscono quali siano i causal estimands di interesse e ciò limita di molto la rilevanza del paper stesso.</w:t>
+        <w:t xml:space="preserve">Chiarire la differenza tra </w:t>
+      </w:r>
+      <w:proofErr w:type="spellStart"/>
+      <w:r>
+        <w:t>c</w:t>
+      </w:r>
+      <w:r>
+        <w:t>ausal</w:t>
+      </w:r>
+      <w:proofErr w:type="spellEnd"/>
+      <w:r>
+        <w:t xml:space="preserve"> estimands and </w:t>
+      </w:r>
+      <w:proofErr w:type="spellStart"/>
+      <w:r>
+        <w:t>estimators</w:t>
+      </w:r>
+      <w:proofErr w:type="spellEnd"/>
+      <w:r>
+        <w:t xml:space="preserve">. Spiegare i principali </w:t>
+      </w:r>
+      <w:proofErr w:type="spellStart"/>
+      <w:r>
+        <w:t>causal</w:t>
+      </w:r>
+      <w:proofErr w:type="spellEnd"/>
+      <w:r>
+        <w:t xml:space="preserve"> estimands con i loro pro e contro. Dire che non sempre i paper chiariscono quali siano i </w:t>
+      </w:r>
+      <w:proofErr w:type="spellStart"/>
+      <w:r>
+        <w:t>causal</w:t>
+      </w:r>
+      <w:proofErr w:type="spellEnd"/>
+      <w:r>
+        <w:t xml:space="preserve"> estimands di interesse e ciò limita di molto la rilevanza del paper stesso.</w:t>
       </w:r>
     </w:p>
     <w:p>
@@ -197,11 +229,13 @@
           <w:numId w:val="2"/>
         </w:numPr>
         <w:rPr>
-          <w:lang w:val="en-US"/>
-        </w:rPr>
-      </w:pPr>
-      <w:r>
-        <w:rPr>
+          <w:highlight w:val="darkGray"/>
+          <w:lang w:val="en-US"/>
+        </w:rPr>
+      </w:pPr>
+      <w:r>
+        <w:rPr>
+          <w:highlight w:val="darkGray"/>
           <w:lang w:val="en-US"/>
         </w:rPr>
         <w:t>No formulae at all?</w:t>
@@ -214,12 +248,15 @@
           <w:ilvl w:val="0"/>
           <w:numId w:val="2"/>
         </w:numPr>
-      </w:pPr>
-      <w:r>
-        <w:t>Magari metterlo online come e</w:t>
-      </w:r>
-      <w:r>
-        <w:t>book, come fatto da Molnar</w:t>
+        <w:rPr>
+          <w:highlight w:val="darkGray"/>
+        </w:rPr>
+      </w:pPr>
+      <w:r>
+        <w:rPr>
+          <w:highlight w:val="darkGray"/>
+        </w:rPr>
+        <w:t>Magari metterlo online come ebook, come fatto da Molnar</w:t>
       </w:r>
     </w:p>
     <w:p>
@@ -230,32 +267,30 @@
           <w:numId w:val="2"/>
         </w:numPr>
         <w:rPr>
-          <w:lang w:val="en-US"/>
-        </w:rPr>
-      </w:pPr>
-      <w:r>
-        <w:rPr>
+          <w:highlight w:val="darkGray"/>
+          <w:lang w:val="en-US"/>
+        </w:rPr>
+      </w:pPr>
+      <w:r>
+        <w:rPr>
+          <w:highlight w:val="darkGray"/>
           <w:lang w:val="en-US"/>
         </w:rPr>
         <w:t xml:space="preserve">Of course, this is </w:t>
       </w:r>
       <w:r>
         <w:rPr>
+          <w:highlight w:val="darkGray"/>
           <w:lang w:val="en-US"/>
         </w:rPr>
         <w:t xml:space="preserve">no ground truth but just </w:t>
       </w:r>
       <w:r>
         <w:rPr>
-          <w:lang w:val="en-US"/>
-        </w:rPr>
-        <w:t>m</w:t>
-      </w:r>
-      <w:r>
-        <w:rPr>
-          <w:lang w:val="en-US"/>
-        </w:rPr>
-        <w:t>y personal view after 15 years in the profession…</w:t>
+          <w:highlight w:val="darkGray"/>
+          <w:lang w:val="en-US"/>
+        </w:rPr>
+        <w:t>my personal view after 15 years in the profession…</w:t>
       </w:r>
     </w:p>
     <w:p>
@@ -280,8 +315,14 @@
           <w:ilvl w:val="0"/>
           <w:numId w:val="2"/>
         </w:numPr>
-      </w:pPr>
-      <w:r>
+        <w:rPr>
+          <w:highlight w:val="darkGray"/>
+        </w:rPr>
+      </w:pPr>
+      <w:r>
+        <w:rPr>
+          <w:highlight w:val="darkGray"/>
+        </w:rPr>
         <w:t>Nessun gergo tecnico. Unici termini tecnici in corsivo.</w:t>
       </w:r>
     </w:p>
@@ -292,8 +333,14 @@
           <w:ilvl w:val="0"/>
           <w:numId w:val="2"/>
         </w:numPr>
-      </w:pPr>
-      <w:r>
+        <w:rPr>
+          <w:highlight w:val="darkGray"/>
+        </w:rPr>
+      </w:pPr>
+      <w:r>
+        <w:rPr>
+          <w:highlight w:val="darkGray"/>
+        </w:rPr>
         <w:t>Fare una serie di piccoli grafici per far capire il funzionamento dei principali metodi di valutazione</w:t>
       </w:r>
     </w:p>
@@ -304,8 +351,14 @@
           <w:ilvl w:val="0"/>
           <w:numId w:val="2"/>
         </w:numPr>
-      </w:pPr>
-      <w:r>
+        <w:rPr>
+          <w:highlight w:val="darkGray"/>
+        </w:rPr>
+      </w:pPr>
+      <w:r>
+        <w:rPr>
+          <w:highlight w:val="darkGray"/>
+        </w:rPr>
         <w:t>Fare analisi facilmente comprensibili dovrebbe facilitare la trasparenza di tali metodi, requisito importante per far prendere in considerazione tali metodi dai policymakers</w:t>
       </w:r>
     </w:p>
@@ -435,7 +488,15 @@
         <w:t>Creare alla fine del lib</w:t>
       </w:r>
       <w:r>
-        <w:t>ro un glossario con la definizione di alcuni termini chiave come endogeneità, esogeneità, …</w:t>
+        <w:t xml:space="preserve">ro un glossario con la definizione di alcuni termini chiave come endogeneità, </w:t>
+      </w:r>
+      <w:proofErr w:type="spellStart"/>
+      <w:r>
+        <w:t>esogeneità</w:t>
+      </w:r>
+      <w:proofErr w:type="spellEnd"/>
+      <w:r>
+        <w:t>, …</w:t>
       </w:r>
     </w:p>
     <w:p>
@@ -447,7 +508,31 @@
         </w:numPr>
       </w:pPr>
       <w:r>
-        <w:t>Chiarire le scelte nel caso di staggered adoption. Ad esempio chiarire i pro e i contro di includere/non includere i later treated nel gruppo di controllo. Avrebbe concettualmente senso farlo (sono i più simili ai trattati), ma questo automaticamente porta a stime distorte in caso di effetti non nulli del trattamento</w:t>
+        <w:t xml:space="preserve">Chiarire le scelte nel caso di </w:t>
+      </w:r>
+      <w:proofErr w:type="spellStart"/>
+      <w:r>
+        <w:t>staggered</w:t>
+      </w:r>
+      <w:proofErr w:type="spellEnd"/>
+      <w:r>
+        <w:t xml:space="preserve"> adoption. Ad esempio chiarire i pro e i contro di includere/non includere i </w:t>
+      </w:r>
+      <w:proofErr w:type="spellStart"/>
+      <w:r>
+        <w:t>later</w:t>
+      </w:r>
+      <w:proofErr w:type="spellEnd"/>
+      <w:r>
+        <w:t xml:space="preserve"> </w:t>
+      </w:r>
+      <w:proofErr w:type="spellStart"/>
+      <w:r>
+        <w:t>treated</w:t>
+      </w:r>
+      <w:proofErr w:type="spellEnd"/>
+      <w:r>
+        <w:t xml:space="preserve"> nel gruppo di controllo. Avrebbe concettualmente senso farlo (sono i più simili ai trattati), ma questo automaticamente porta a stime distorte in caso di effetti non nulli del trattamento</w:t>
       </w:r>
     </w:p>
     <w:p>

</xml_diff>